<commit_message>
Cordes solo: bridge hill + table d'harmonie + caisse, toutes valeurs CSV v3 vérifiées (Fp, σ, Δ convergences), doublures Fp corrigées
</commit_message>
<xml_diff>
--- a/Versions-html-and-docx/section_cordes_v5.docx
+++ b/Versions-html-and-docx/section_cordes_v5.docx
@@ -33,7 +33,7 @@
         <w:t xml:space="preserve">Découverte clé : </w:t>
       </w:r>
       <w:r>
-        <w:t>Violon (506 Hz) + Basson (495 Hz) = Δ=11 Hz — convergence /o/ quasi-parfaite. Violoncelle (F1=205 Hz, /u/) : rejoint la zone /o/ via son Fp (~600 Hz). Effet de section : F1 violon quasi-stable (−2 %), F2 −23 % — homogénéisation spectrale.</w:t>
+        <w:t>Violon (506 Hz) + Basson (495 Hz) = Δ=11 Hz — convergence /o/ quasi-parfaite. Violoncelle F2=506 Hz ≈ Basson F1=495 Hz (Δ=11 Hz) — fusion par même zone /o/. Effet de section : F1 violon quasi-stable (−2 %), F2 −23 % — homogénéisation spectrale.</w:t>
       </w:r>
     </w:p>
     <w:p>
@@ -115,7 +115,7 @@
           <w:i/>
           <w:sz w:val="20"/>
         </w:rPr>
-        <w:t>Son brillant et expressif, extrêmement large tessiture spectrale. F1 spectral strict = 506 Hz (zone /o/) mais très variable (σ=235 Hz). F2 extrêmement instable (σ=651 Hz). Le Fp centroïde à 893 Hz (σ=92 Hz) est 7.1× plus stable et correspond au Hauptformant de Meyer (800–1 200 Hz, zone /a/). Sources divergentes : Backus (2 000–3 000) capturait une zone de brillance haute ; Giesler et Meyer convergent sur 1 000–1 200 Hz. SOL2020 Fp=893 Hz confirme la zone /a/ comme signature timbrale perceptive du violon.</w:t>
+        <w:t>Son brillant et expressif, extrêmement large tessiture spectrale. F1=506 Hz (/o/) — résonance grave de la caisse (σ=376 Hz, très variable selon le registre). F2=1 518 Hz extrêmement instable (σ=651 Hz). Le Fp centroïde à 1 253 Hz (zone /a/) est 3.3× plus stable. Le « bridge hill » — résonance mécanique du chevalet — amplifie sélectivement la zone F3–F5 (2 347–3 908 Hz), caractéristique spectrale la plus stable du violon. Giesler et Meyer convergent sur 1 000–1 200 Hz ; Backus (2 000–3 000) capturait la zone bridge hill. Convergence clé : F1 violon (506) ≈ F1 basson (495), Δ=11 Hz — même zone /o/.</w:t>
       </w:r>
     </w:p>
     <w:p>
@@ -8659,7 +8659,7 @@
                 <w:b w:val="0"/>
                 <w:sz w:val="18"/>
               </w:rPr>
-              <w:t>893 (Fp)</w:t>
+              <w:t>1 253 (Fp)</w:t>
             </w:r>
           </w:p>
         </w:tc>
@@ -8677,7 +8677,7 @@
                 <w:b w:val="0"/>
                 <w:sz w:val="18"/>
               </w:rPr>
-              <w:t>1 460 (Fp)</w:t>
+              <w:t>1 393 (Fp)</w:t>
             </w:r>
           </w:p>
         </w:tc>
@@ -8695,7 +8695,7 @@
                 <w:b w:val="0"/>
                 <w:sz w:val="18"/>
               </w:rPr>
-              <w:t>Δ=567 Hz</w:t>
+              <w:t>Δ=140 Hz</w:t>
             </w:r>
           </w:p>
         </w:tc>
@@ -8713,7 +8713,7 @@
                 <w:b w:val="0"/>
                 <w:sz w:val="18"/>
               </w:rPr>
-              <w:t>Complémentaire</w:t>
+              <w:t>Bonne</w:t>
             </w:r>
           </w:p>
         </w:tc>
@@ -8769,7 +8769,7 @@
                 <w:b w:val="0"/>
                 <w:sz w:val="18"/>
               </w:rPr>
-              <w:t>893 (Fp)</w:t>
+              <w:t>1 253 (Fp)</w:t>
             </w:r>
           </w:p>
         </w:tc>
@@ -8787,7 +8787,7 @@
                 <w:b w:val="0"/>
                 <w:sz w:val="18"/>
               </w:rPr>
-              <w:t>1 354 (Fp)</w:t>
+              <w:t>1 352 (Fp)</w:t>
             </w:r>
           </w:p>
         </w:tc>
@@ -8805,7 +8805,7 @@
                 <w:b w:val="0"/>
                 <w:sz w:val="18"/>
               </w:rPr>
-              <w:t>Δ=461 Hz</w:t>
+              <w:t>Δ=99 Hz</w:t>
             </w:r>
           </w:p>
         </w:tc>
@@ -8823,7 +8823,7 @@
                 <w:b w:val="0"/>
                 <w:sz w:val="18"/>
               </w:rPr>
-              <w:t>Complémentaire</w:t>
+              <w:t>Bonne</w:t>
             </w:r>
           </w:p>
         </w:tc>
@@ -8879,7 +8879,7 @@
                 <w:b w:val="0"/>
                 <w:sz w:val="18"/>
               </w:rPr>
-              <w:t>893 (Fp)</w:t>
+              <w:t>1 253 (Fp)</w:t>
             </w:r>
           </w:p>
         </w:tc>
@@ -8897,7 +8897,7 @@
                 <w:b w:val="0"/>
                 <w:sz w:val="18"/>
               </w:rPr>
-              <w:t>1 016 (Fp)</w:t>
+              <w:t>1 296 (Fp)</w:t>
             </w:r>
           </w:p>
         </w:tc>
@@ -8915,7 +8915,7 @@
                 <w:b w:val="0"/>
                 <w:sz w:val="18"/>
               </w:rPr>
-              <w:t>Δ=123 Hz</w:t>
+              <w:t>Δ=43 Hz</w:t>
             </w:r>
           </w:p>
         </w:tc>
@@ -8933,7 +8933,7 @@
                 <w:b w:val="0"/>
                 <w:sz w:val="18"/>
               </w:rPr>
-              <w:t>Bonne</w:t>
+              <w:t>Excellente</w:t>
             </w:r>
           </w:p>
         </w:tc>
@@ -8989,7 +8989,7 @@
                 <w:b w:val="0"/>
                 <w:sz w:val="18"/>
               </w:rPr>
-              <w:t>893 (Fp)</w:t>
+              <w:t>1 253 (Fp)</w:t>
             </w:r>
           </w:p>
         </w:tc>
@@ -9007,7 +9007,7 @@
                 <w:b w:val="0"/>
                 <w:sz w:val="18"/>
               </w:rPr>
-              <w:t>1 046 (Fp)</w:t>
+              <w:t>1 048 (Fp)</w:t>
             </w:r>
           </w:p>
         </w:tc>
@@ -9025,7 +9025,7 @@
                 <w:b w:val="0"/>
                 <w:sz w:val="18"/>
               </w:rPr>
-              <w:t>Δ=153 Hz</w:t>
+              <w:t>Δ=205 Hz</w:t>
             </w:r>
           </w:p>
         </w:tc>
@@ -9043,7 +9043,7 @@
                 <w:b w:val="0"/>
                 <w:sz w:val="18"/>
               </w:rPr>
-              <w:t>Bonne</w:t>
+              <w:t>Complémentaire</w:t>
             </w:r>
           </w:p>
         </w:tc>
@@ -9280,7 +9280,7 @@
           <w:i/>
           <w:sz w:val="20"/>
         </w:rPr>
-        <w:t>Son plus sombre et mélancolique que le violon. F1=369 Hz (zone /å/). Giesler note une grande dépendance au registre (220–600 Hz). Meyer situe le formant principal dans la zone /o/–/a/ (400–1 200 Hz). F1 SOL2020 (369 Hz) est plus stable que le violon. L'alto est acoustiquement dans la zone de transition /å/–/o/, ce qui lui confère sa couleur caractéristique — ni la brillance du violon ni la plénitude du violoncelle.</w:t>
+        <w:t>Son plus sombre et mélancolique que le violon. F1=377 Hz (/å/) — résonance de la caisse (σ=202 Hz). Giesler (220–600 Hz), Meyer (/o/–/a/, 400–1 200 Hz). Le « bridge hill » de l'alto (zone F3 ~1 540 Hz) est plus bas que celui du violon (~2 347 Hz), ce qui explique sa couleur plus sombre. Fp=1 300 Hz (zone /a/), proche du violon Fp=1 253 Hz (Δ=47 Hz) — les deux instruments partagent un centroïde spectral commun. L'alto est dans la zone de transition /å/–/o/, ni la brillance du violon ni la plénitude du violoncelle.</w:t>
       </w:r>
     </w:p>
     <w:p>
@@ -18327,7 +18327,7 @@
           <w:i/>
           <w:sz w:val="20"/>
         </w:rPr>
-        <w:t>Son chaud et expressif, grande profondeur harmonique. F1=205 Hz (zone /u/) — profondeur grave. Accord entre sources : Giesler (300–500), Meyer (~500), Yan_Adds (499 Hz) mesurent une zone spectrale différente (F2 ou registre aigu). Convergences clés via F1 : Trombone (237 Hz, Δ=32 Hz), Tuba basse (226 Hz, Δ=21 Hz). Via Fp (600 Hz) : rapprochement avec la zone /o/ du basson et du cor.</w:t>
+        <w:t>Son chaud et expressif, grande profondeur harmonique. F1=205 Hz (/u/) — résonance de la table d'harmonie (σ=287 Hz). F2=506 Hz (/o/) — second mode mais nettement dominant dans le rayonnement perceptuel. La fusion légendaire violoncelle–basson s'explique par la quasi-identité F2 violoncelle (506 Hz) ≈ F1 basson (495 Hz), Δ=11 Hz — deux instruments atteignant la même zone /o/ par des mécanismes acoustiques différents (table d'harmonie vs colonne d'air). Convergences F1 : Trombone (237 Hz, Δ=32 Hz), Tuba basse (226 Hz, Δ=21 Hz). Fp=1 242 Hz converge avec Trombone Fp=1 218 Hz (Δ=24 Hz) et Tuba Fp=1 206 Hz (Δ=36 Hz).</w:t>
       </w:r>
     </w:p>
     <w:p>
@@ -27886,7 +27886,7 @@
           <w:i/>
           <w:sz w:val="20"/>
         </w:rPr>
-        <w:t>Son très grave, rôle de fondation harmonique de l'orchestre. F1=200 Hz (zone /u/) — la résonance fondamentale de la caisse. Giesler note une zone basse 70–250 Hz avec un formant secondaire à 400 Hz. Grande variabilité : la contrebasse est l'instrument à cordes le moins formulable par un F1 unique.</w:t>
+        <w:t>Son très grave, fondation harmonique de l'orchestre. F1=172 Hz (/u/) — résonance fondamentale de la caisse (σ=36 Hz — le F1 le plus stable de toutes les cordes). Giesler : Hauptformant 70–250 Hz (/u/), Nebenformant 400 Hz (/o/). F2=474 Hz confirme ce Nebenformant. Fp=1 235 Hz, quasi-identique au violoncelle (1 242, Δ=7 Hz) — les deux partagent le même centroïde spectral. Convergence F1 : Tuba contrebasse (226 Hz, Δ=54 Hz).</w:t>
       </w:r>
     </w:p>
     <w:p>
@@ -36665,7 +36665,7 @@
           <w:i w:val="0"/>
           <w:sz w:val="20"/>
         </w:rPr>
-        <w:t>Les données d'ensemble montrent un effet de section (compression formantique) systématique : le F1 collectif est significativement plus haut qu'en solo. Exemple le plus marqué : Violon solo F1=506 Hz (Fp=893) → Ensemble de violons F1=1 556 Hz.</w:t>
+        <w:t>Les données d'ensemble montrent un effet de section (compression formantique) systématique. Violon solo F1=506 Hz → Ensemble F1=495 Hz (Δ=−2 %), mais F2 passe de 1 518 à 1 163 Hz (−23 %) — l'effet de section lisse F2–F3, pas F1.</w:t>
       </w:r>
     </w:p>
     <w:p>

</xml_diff>